<commit_message>
Adicionado código para análise das faixas etárias, juntamente com as imagens dos gráficos e alteração no relatório com as análises (não no relatório final)
</commit_message>
<xml_diff>
--- a/Projeto B - Relatório (com gráficos)/Relatório_Projeto_B.docx
+++ b/Projeto B - Relatório (com gráficos)/Relatório_Projeto_B.docx
@@ -360,6 +360,210 @@
         <w:rPr>
           <w:sz w:val="24"/>
           <w:szCs w:val="24"/>
+        </w:rPr>
+      </w:pPr>
+      <w:r>
+        <w:rPr>
+          <w:sz w:val="24"/>
+          <w:szCs w:val="24"/>
+        </w:rPr>
+        <w:t>ELAPSED</w:t>
+      </w:r>
+    </w:p>
+    <w:p>
+      <w:pPr>
+        <w:rPr>
+          <w:sz w:val="24"/>
+          <w:szCs w:val="24"/>
+        </w:rPr>
+      </w:pPr>
+      <w:proofErr w:type="gramStart"/>
+      <w:r>
+        <w:rPr>
+          <w:sz w:val="24"/>
+          <w:szCs w:val="24"/>
+        </w:rPr>
+        <w:t xml:space="preserve">Nosso  </w:t>
+      </w:r>
+      <w:proofErr w:type="spellStart"/>
+      <w:r>
+        <w:rPr>
+          <w:sz w:val="24"/>
+          <w:szCs w:val="24"/>
+        </w:rPr>
+        <w:t>median</w:t>
+      </w:r>
+      <w:proofErr w:type="spellEnd"/>
+      <w:proofErr w:type="gramEnd"/>
+      <w:r>
+        <w:rPr>
+          <w:sz w:val="24"/>
+          <w:szCs w:val="24"/>
+        </w:rPr>
+        <w:t>: 12.652</w:t>
+      </w:r>
+    </w:p>
+    <w:p>
+      <w:pPr>
+        <w:rPr>
+          <w:sz w:val="24"/>
+          <w:szCs w:val="24"/>
+        </w:rPr>
+      </w:pPr>
+      <w:r>
+        <w:rPr>
+          <w:sz w:val="24"/>
+          <w:szCs w:val="24"/>
+        </w:rPr>
+        <w:t xml:space="preserve">Prof   </w:t>
+      </w:r>
+      <w:proofErr w:type="spellStart"/>
+      <w:r>
+        <w:rPr>
+          <w:sz w:val="24"/>
+          <w:szCs w:val="24"/>
+        </w:rPr>
+        <w:t>median</w:t>
+      </w:r>
+      <w:proofErr w:type="spellEnd"/>
+      <w:r>
+        <w:rPr>
+          <w:sz w:val="24"/>
+          <w:szCs w:val="24"/>
+        </w:rPr>
+        <w:t>: 19.613</w:t>
+      </w:r>
+    </w:p>
+    <w:p>
+      <w:pPr>
+        <w:rPr>
+          <w:sz w:val="24"/>
+          <w:szCs w:val="24"/>
+        </w:rPr>
+      </w:pPr>
+      <w:r>
+        <w:rPr>
+          <w:sz w:val="24"/>
+          <w:szCs w:val="24"/>
+        </w:rPr>
+        <w:t>U = 1974.5, p = 0.0000, r = 0.112</w:t>
+      </w:r>
+    </w:p>
+    <w:p>
+      <w:pPr>
+        <w:rPr>
+          <w:sz w:val="24"/>
+          <w:szCs w:val="24"/>
+        </w:rPr>
+      </w:pPr>
+    </w:p>
+    <w:p>
+      <w:pPr>
+        <w:rPr>
+          <w:sz w:val="24"/>
+          <w:szCs w:val="24"/>
+        </w:rPr>
+      </w:pPr>
+      <w:r>
+        <w:rPr>
+          <w:sz w:val="24"/>
+          <w:szCs w:val="24"/>
+        </w:rPr>
+        <w:t>TIME_PER_TARGET</w:t>
+      </w:r>
+    </w:p>
+    <w:p>
+      <w:pPr>
+        <w:rPr>
+          <w:sz w:val="24"/>
+          <w:szCs w:val="24"/>
+        </w:rPr>
+      </w:pPr>
+      <w:proofErr w:type="gramStart"/>
+      <w:r>
+        <w:rPr>
+          <w:sz w:val="24"/>
+          <w:szCs w:val="24"/>
+        </w:rPr>
+        <w:t xml:space="preserve">Nosso  </w:t>
+      </w:r>
+      <w:proofErr w:type="spellStart"/>
+      <w:r>
+        <w:rPr>
+          <w:sz w:val="24"/>
+          <w:szCs w:val="24"/>
+        </w:rPr>
+        <w:t>median</w:t>
+      </w:r>
+      <w:proofErr w:type="spellEnd"/>
+      <w:proofErr w:type="gramEnd"/>
+      <w:r>
+        <w:rPr>
+          <w:sz w:val="24"/>
+          <w:szCs w:val="24"/>
+        </w:rPr>
+        <w:t>: 0.633</w:t>
+      </w:r>
+    </w:p>
+    <w:p>
+      <w:pPr>
+        <w:rPr>
+          <w:sz w:val="24"/>
+          <w:szCs w:val="24"/>
+        </w:rPr>
+      </w:pPr>
+      <w:r>
+        <w:rPr>
+          <w:sz w:val="24"/>
+          <w:szCs w:val="24"/>
+        </w:rPr>
+        <w:t xml:space="preserve">Prof   </w:t>
+      </w:r>
+      <w:proofErr w:type="spellStart"/>
+      <w:r>
+        <w:rPr>
+          <w:sz w:val="24"/>
+          <w:szCs w:val="24"/>
+        </w:rPr>
+        <w:t>median</w:t>
+      </w:r>
+      <w:proofErr w:type="spellEnd"/>
+      <w:r>
+        <w:rPr>
+          <w:sz w:val="24"/>
+          <w:szCs w:val="24"/>
+        </w:rPr>
+        <w:t>: 0.985</w:t>
+      </w:r>
+    </w:p>
+    <w:p>
+      <w:pPr>
+        <w:rPr>
+          <w:sz w:val="24"/>
+          <w:szCs w:val="24"/>
+        </w:rPr>
+      </w:pPr>
+      <w:r>
+        <w:rPr>
+          <w:sz w:val="24"/>
+          <w:szCs w:val="24"/>
+        </w:rPr>
+        <w:t>U = 1488.5, p = 0.0000, r = 0.085</w:t>
+      </w:r>
+    </w:p>
+    <w:p>
+      <w:pPr>
+        <w:rPr>
+          <w:sz w:val="24"/>
+          <w:szCs w:val="24"/>
+        </w:rPr>
+      </w:pPr>
+    </w:p>
+    <w:p>
+      <w:pPr>
+        <w:rPr>
+          <w:sz w:val="24"/>
+          <w:szCs w:val="24"/>
           <w:lang w:val="en-US"/>
         </w:rPr>
       </w:pPr>
@@ -369,7 +573,7 @@
           <w:szCs w:val="24"/>
           <w:lang w:val="en-US"/>
         </w:rPr>
-        <w:t>ELAPSED</w:t>
+        <w:t>SUCCESS_RATE</w:t>
       </w:r>
     </w:p>
     <w:p>
@@ -406,7 +610,7 @@
           <w:szCs w:val="24"/>
           <w:lang w:val="en-US"/>
         </w:rPr>
-        <w:t>: 12.652</w:t>
+        <w:t>: 1.000</w:t>
       </w:r>
     </w:p>
     <w:p>
@@ -423,147 +627,45 @@
           <w:szCs w:val="24"/>
           <w:lang w:val="en-US"/>
         </w:rPr>
-        <w:t>Prof   median: 19.613</w:t>
-      </w:r>
-    </w:p>
-    <w:p>
-      <w:pPr>
-        <w:rPr>
-          <w:sz w:val="24"/>
-          <w:szCs w:val="24"/>
-          <w:lang w:val="en-US"/>
-        </w:rPr>
-      </w:pPr>
-      <w:r>
-        <w:rPr>
-          <w:sz w:val="24"/>
-          <w:szCs w:val="24"/>
-          <w:lang w:val="en-US"/>
-        </w:rPr>
-        <w:t>U = 1974.5, p = 0.0000, r = 0.112</w:t>
-      </w:r>
-    </w:p>
-    <w:p>
-      <w:pPr>
-        <w:rPr>
-          <w:sz w:val="24"/>
-          <w:szCs w:val="24"/>
-          <w:lang w:val="en-US"/>
-        </w:rPr>
-      </w:pPr>
-    </w:p>
-    <w:p>
-      <w:pPr>
-        <w:rPr>
-          <w:sz w:val="24"/>
-          <w:szCs w:val="24"/>
-          <w:lang w:val="en-US"/>
-        </w:rPr>
-      </w:pPr>
-      <w:r>
-        <w:rPr>
-          <w:sz w:val="24"/>
-          <w:szCs w:val="24"/>
-          <w:lang w:val="en-US"/>
-        </w:rPr>
-        <w:t>TIME_PER_TARGET</w:t>
-      </w:r>
-    </w:p>
-    <w:p>
-      <w:pPr>
-        <w:rPr>
-          <w:sz w:val="24"/>
-          <w:szCs w:val="24"/>
-          <w:lang w:val="en-US"/>
-        </w:rPr>
-      </w:pPr>
-      <w:proofErr w:type="spellStart"/>
-      <w:proofErr w:type="gramStart"/>
-      <w:r>
-        <w:rPr>
-          <w:sz w:val="24"/>
-          <w:szCs w:val="24"/>
-          <w:lang w:val="en-US"/>
-        </w:rPr>
-        <w:t>Nosso</w:t>
-      </w:r>
-      <w:proofErr w:type="spellEnd"/>
-      <w:r>
-        <w:rPr>
-          <w:sz w:val="24"/>
-          <w:szCs w:val="24"/>
-          <w:lang w:val="en-US"/>
-        </w:rPr>
-        <w:t xml:space="preserve">  median</w:t>
-      </w:r>
-      <w:proofErr w:type="gramEnd"/>
-      <w:r>
-        <w:rPr>
-          <w:sz w:val="24"/>
-          <w:szCs w:val="24"/>
-          <w:lang w:val="en-US"/>
-        </w:rPr>
-        <w:t>: 0.633</w:t>
-      </w:r>
-    </w:p>
-    <w:p>
-      <w:pPr>
-        <w:rPr>
-          <w:sz w:val="24"/>
-          <w:szCs w:val="24"/>
-          <w:lang w:val="en-US"/>
-        </w:rPr>
-      </w:pPr>
-      <w:r>
-        <w:rPr>
-          <w:sz w:val="24"/>
-          <w:szCs w:val="24"/>
-          <w:lang w:val="en-US"/>
-        </w:rPr>
-        <w:t>Prof   median: 0.985</w:t>
-      </w:r>
-    </w:p>
-    <w:p>
-      <w:pPr>
-        <w:rPr>
-          <w:sz w:val="24"/>
-          <w:szCs w:val="24"/>
-          <w:lang w:val="en-US"/>
-        </w:rPr>
-      </w:pPr>
-      <w:r>
-        <w:rPr>
-          <w:sz w:val="24"/>
-          <w:szCs w:val="24"/>
-          <w:lang w:val="en-US"/>
-        </w:rPr>
-        <w:t>U = 1488.5, p = 0.0000, r = 0.085</w:t>
-      </w:r>
-    </w:p>
-    <w:p>
-      <w:pPr>
-        <w:rPr>
-          <w:sz w:val="24"/>
-          <w:szCs w:val="24"/>
-          <w:lang w:val="en-US"/>
-        </w:rPr>
-      </w:pPr>
-    </w:p>
-    <w:p>
-      <w:pPr>
-        <w:rPr>
-          <w:sz w:val="24"/>
-          <w:szCs w:val="24"/>
-          <w:lang w:val="en-US"/>
-        </w:rPr>
-      </w:pPr>
-      <w:r>
-        <w:rPr>
-          <w:sz w:val="24"/>
-          <w:szCs w:val="24"/>
-          <w:lang w:val="en-US"/>
-        </w:rPr>
-        <w:t>SUCCESS_RATE</w:t>
+        <w:t>Prof   median: 1.000</w:t>
+      </w:r>
+    </w:p>
+    <w:p>
+      <w:pPr>
+        <w:rPr>
+          <w:sz w:val="24"/>
+          <w:szCs w:val="24"/>
+        </w:rPr>
+      </w:pPr>
+      <w:r>
+        <w:rPr>
+          <w:sz w:val="24"/>
+          <w:szCs w:val="24"/>
+        </w:rPr>
+        <w:t>U = 9190.5, p = 0.9194, r = 0.520</w:t>
+      </w:r>
+    </w:p>
+    <w:p>
+      <w:pPr>
+        <w:rPr>
+          <w:sz w:val="24"/>
+          <w:szCs w:val="24"/>
+        </w:rPr>
+      </w:pPr>
+    </w:p>
+    <w:p>
+      <w:pPr>
+        <w:rPr>
+          <w:sz w:val="24"/>
+          <w:szCs w:val="24"/>
+        </w:rPr>
+      </w:pPr>
+      <w:r>
+        <w:rPr>
+          <w:sz w:val="24"/>
+          <w:szCs w:val="24"/>
+        </w:rPr>
+        <w:t>ERRORS</w:t>
       </w:r>
     </w:p>
     <w:p>
@@ -596,7 +698,7 @@
           <w:sz w:val="24"/>
           <w:szCs w:val="24"/>
         </w:rPr>
-        <w:t>: 1.000</w:t>
+        <w:t>: 2.000</w:t>
       </w:r>
     </w:p>
     <w:p>
@@ -627,43 +729,349 @@
           <w:sz w:val="24"/>
           <w:szCs w:val="24"/>
         </w:rPr>
-        <w:t>: 1.000</w:t>
-      </w:r>
-    </w:p>
-    <w:p>
-      <w:pPr>
-        <w:rPr>
-          <w:sz w:val="24"/>
-          <w:szCs w:val="24"/>
-        </w:rPr>
-      </w:pPr>
-      <w:r>
-        <w:rPr>
-          <w:sz w:val="24"/>
-          <w:szCs w:val="24"/>
-        </w:rPr>
-        <w:t>U = 9190.5, p = 0.9194, r = 0.520</w:t>
-      </w:r>
-    </w:p>
-    <w:p>
-      <w:pPr>
-        <w:rPr>
-          <w:sz w:val="24"/>
-          <w:szCs w:val="24"/>
-        </w:rPr>
-      </w:pPr>
-    </w:p>
-    <w:p>
-      <w:pPr>
-        <w:rPr>
-          <w:sz w:val="24"/>
-          <w:szCs w:val="24"/>
-        </w:rPr>
-      </w:pPr>
-      <w:r>
-        <w:rPr>
-          <w:sz w:val="24"/>
-          <w:szCs w:val="24"/>
+        <w:t>: 2.000</w:t>
+      </w:r>
+    </w:p>
+    <w:p>
+      <w:pPr>
+        <w:rPr>
+          <w:sz w:val="24"/>
+          <w:szCs w:val="24"/>
+        </w:rPr>
+      </w:pPr>
+      <w:r>
+        <w:rPr>
+          <w:sz w:val="24"/>
+          <w:szCs w:val="24"/>
+        </w:rPr>
+        <w:t>U = 7999.5, p = 0.0909, r = 0.453</w:t>
+      </w:r>
+    </w:p>
+    <w:p>
+      <w:pPr>
+        <w:rPr>
+          <w:sz w:val="24"/>
+          <w:szCs w:val="24"/>
+        </w:rPr>
+      </w:pPr>
+    </w:p>
+    <w:p>
+      <w:pPr>
+        <w:rPr>
+          <w:sz w:val="24"/>
+          <w:szCs w:val="24"/>
+        </w:rPr>
+      </w:pPr>
+    </w:p>
+    <w:p>
+      <w:pPr>
+        <w:rPr>
+          <w:sz w:val="24"/>
+          <w:szCs w:val="24"/>
+        </w:rPr>
+      </w:pPr>
+      <w:r>
+        <w:rPr>
+          <w:sz w:val="24"/>
+          <w:szCs w:val="24"/>
+        </w:rPr>
+        <w:t>Após isto fo</w:t>
+      </w:r>
+      <w:r>
+        <w:rPr>
+          <w:sz w:val="24"/>
+          <w:szCs w:val="24"/>
+        </w:rPr>
+        <w:t>ram</w:t>
+      </w:r>
+      <w:r>
+        <w:rPr>
+          <w:sz w:val="24"/>
+          <w:szCs w:val="24"/>
+        </w:rPr>
+        <w:t xml:space="preserve"> também analisados os resultados de ambos os grupos etários presentes</w:t>
+      </w:r>
+      <w:r>
+        <w:rPr>
+          <w:sz w:val="24"/>
+          <w:szCs w:val="24"/>
+        </w:rPr>
+        <w:t xml:space="preserve"> (na</w:t>
+      </w:r>
+      <w:r>
+        <w:rPr>
+          <w:sz w:val="24"/>
+          <w:szCs w:val="24"/>
+        </w:rPr>
+        <w:t xml:space="preserve"> solução </w:t>
+      </w:r>
+      <w:r>
+        <w:rPr>
+          <w:sz w:val="24"/>
+          <w:szCs w:val="24"/>
+        </w:rPr>
+        <w:t>proposta)</w:t>
+      </w:r>
+      <w:r>
+        <w:rPr>
+          <w:sz w:val="24"/>
+          <w:szCs w:val="24"/>
+        </w:rPr>
+        <w:t>, os quais são dos 20 aos 30 anos de idade e dos 50 aos 60, obtendo os seguintes resultados:</w:t>
+      </w:r>
+    </w:p>
+    <w:p>
+      <w:pPr>
+        <w:rPr>
+          <w:sz w:val="24"/>
+          <w:szCs w:val="24"/>
+        </w:rPr>
+      </w:pPr>
+    </w:p>
+    <w:p>
+      <w:pPr>
+        <w:rPr>
+          <w:sz w:val="24"/>
+          <w:szCs w:val="24"/>
+          <w:lang w:val="en-US"/>
+        </w:rPr>
+      </w:pPr>
+      <w:r>
+        <w:rPr>
+          <w:sz w:val="24"/>
+          <w:szCs w:val="24"/>
+          <w:lang w:val="en-US"/>
+        </w:rPr>
+        <w:t>ELAPSED</w:t>
+      </w:r>
+    </w:p>
+    <w:p>
+      <w:pPr>
+        <w:rPr>
+          <w:sz w:val="24"/>
+          <w:szCs w:val="24"/>
+          <w:lang w:val="en-US"/>
+        </w:rPr>
+      </w:pPr>
+      <w:r>
+        <w:rPr>
+          <w:sz w:val="24"/>
+          <w:szCs w:val="24"/>
+          <w:lang w:val="en-US"/>
+        </w:rPr>
+        <w:t>20–30 median: 12.466</w:t>
+      </w:r>
+    </w:p>
+    <w:p>
+      <w:pPr>
+        <w:rPr>
+          <w:sz w:val="24"/>
+          <w:szCs w:val="24"/>
+          <w:lang w:val="en-US"/>
+        </w:rPr>
+      </w:pPr>
+      <w:r>
+        <w:rPr>
+          <w:sz w:val="24"/>
+          <w:szCs w:val="24"/>
+          <w:lang w:val="en-US"/>
+        </w:rPr>
+        <w:t>50–60 median: 14.990</w:t>
+      </w:r>
+    </w:p>
+    <w:p>
+      <w:pPr>
+        <w:rPr>
+          <w:sz w:val="24"/>
+          <w:szCs w:val="24"/>
+          <w:lang w:val="en-US"/>
+        </w:rPr>
+      </w:pPr>
+      <w:r>
+        <w:rPr>
+          <w:sz w:val="24"/>
+          <w:szCs w:val="24"/>
+          <w:lang w:val="en-US"/>
+        </w:rPr>
+        <w:t>U = 426.0, p = 0.0000, r = 0.113</w:t>
+      </w:r>
+    </w:p>
+    <w:p>
+      <w:pPr>
+        <w:rPr>
+          <w:sz w:val="24"/>
+          <w:szCs w:val="24"/>
+          <w:lang w:val="en-US"/>
+        </w:rPr>
+      </w:pPr>
+    </w:p>
+    <w:p>
+      <w:pPr>
+        <w:rPr>
+          <w:sz w:val="24"/>
+          <w:szCs w:val="24"/>
+          <w:lang w:val="en-US"/>
+        </w:rPr>
+      </w:pPr>
+      <w:r>
+        <w:rPr>
+          <w:sz w:val="24"/>
+          <w:szCs w:val="24"/>
+          <w:lang w:val="en-US"/>
+        </w:rPr>
+        <w:t>TIME_PER_TARGET</w:t>
+      </w:r>
+    </w:p>
+    <w:p>
+      <w:pPr>
+        <w:rPr>
+          <w:sz w:val="24"/>
+          <w:szCs w:val="24"/>
+          <w:lang w:val="es-MX"/>
+        </w:rPr>
+      </w:pPr>
+      <w:r>
+        <w:rPr>
+          <w:sz w:val="24"/>
+          <w:szCs w:val="24"/>
+          <w:lang w:val="es-MX"/>
+        </w:rPr>
+        <w:t>20–30 median: 0.623</w:t>
+      </w:r>
+    </w:p>
+    <w:p>
+      <w:pPr>
+        <w:rPr>
+          <w:sz w:val="24"/>
+          <w:szCs w:val="24"/>
+          <w:lang w:val="es-MX"/>
+        </w:rPr>
+      </w:pPr>
+      <w:r>
+        <w:rPr>
+          <w:sz w:val="24"/>
+          <w:szCs w:val="24"/>
+          <w:lang w:val="es-MX"/>
+        </w:rPr>
+        <w:t>50–60 median: 0.750</w:t>
+      </w:r>
+    </w:p>
+    <w:p>
+      <w:pPr>
+        <w:rPr>
+          <w:sz w:val="24"/>
+          <w:szCs w:val="24"/>
+          <w:lang w:val="es-MX"/>
+        </w:rPr>
+      </w:pPr>
+      <w:r>
+        <w:rPr>
+          <w:sz w:val="24"/>
+          <w:szCs w:val="24"/>
+          <w:lang w:val="es-MX"/>
+        </w:rPr>
+        <w:t>U = 419.0, p = 0.0000, r = 0.111</w:t>
+      </w:r>
+    </w:p>
+    <w:p>
+      <w:pPr>
+        <w:rPr>
+          <w:sz w:val="24"/>
+          <w:szCs w:val="24"/>
+          <w:lang w:val="es-MX"/>
+        </w:rPr>
+      </w:pPr>
+    </w:p>
+    <w:p>
+      <w:pPr>
+        <w:rPr>
+          <w:sz w:val="24"/>
+          <w:szCs w:val="24"/>
+          <w:lang w:val="en-US"/>
+        </w:rPr>
+      </w:pPr>
+      <w:r>
+        <w:rPr>
+          <w:sz w:val="24"/>
+          <w:szCs w:val="24"/>
+          <w:lang w:val="en-US"/>
+        </w:rPr>
+        <w:t>SUCCESS_RATE</w:t>
+      </w:r>
+    </w:p>
+    <w:p>
+      <w:pPr>
+        <w:rPr>
+          <w:sz w:val="24"/>
+          <w:szCs w:val="24"/>
+          <w:lang w:val="en-US"/>
+        </w:rPr>
+      </w:pPr>
+      <w:r>
+        <w:rPr>
+          <w:sz w:val="24"/>
+          <w:szCs w:val="24"/>
+          <w:lang w:val="en-US"/>
+        </w:rPr>
+        <w:t>20–30 median: 1.000</w:t>
+      </w:r>
+    </w:p>
+    <w:p>
+      <w:pPr>
+        <w:rPr>
+          <w:sz w:val="24"/>
+          <w:szCs w:val="24"/>
+          <w:lang w:val="en-US"/>
+        </w:rPr>
+      </w:pPr>
+      <w:r>
+        <w:rPr>
+          <w:sz w:val="24"/>
+          <w:szCs w:val="24"/>
+          <w:lang w:val="en-US"/>
+        </w:rPr>
+        <w:t>50–60 median: 1.000</w:t>
+      </w:r>
+    </w:p>
+    <w:p>
+      <w:pPr>
+        <w:rPr>
+          <w:sz w:val="24"/>
+          <w:szCs w:val="24"/>
+          <w:lang w:val="en-US"/>
+        </w:rPr>
+      </w:pPr>
+      <w:r>
+        <w:rPr>
+          <w:sz w:val="24"/>
+          <w:szCs w:val="24"/>
+          <w:lang w:val="en-US"/>
+        </w:rPr>
+        <w:t>U = 1863.0, p = 0.7873, r = 0.494</w:t>
+      </w:r>
+    </w:p>
+    <w:p>
+      <w:pPr>
+        <w:rPr>
+          <w:sz w:val="24"/>
+          <w:szCs w:val="24"/>
+          <w:lang w:val="en-US"/>
+        </w:rPr>
+      </w:pPr>
+    </w:p>
+    <w:p>
+      <w:pPr>
+        <w:rPr>
+          <w:sz w:val="24"/>
+          <w:szCs w:val="24"/>
+          <w:lang w:val="es-MX"/>
+        </w:rPr>
+      </w:pPr>
+      <w:r>
+        <w:rPr>
+          <w:sz w:val="24"/>
+          <w:szCs w:val="24"/>
+          <w:lang w:val="es-MX"/>
         </w:rPr>
         <w:t>ERRORS</w:t>
       </w:r>
@@ -673,102 +1081,69 @@
         <w:rPr>
           <w:sz w:val="24"/>
           <w:szCs w:val="24"/>
-        </w:rPr>
-      </w:pPr>
-      <w:proofErr w:type="gramStart"/>
-      <w:r>
-        <w:rPr>
-          <w:sz w:val="24"/>
-          <w:szCs w:val="24"/>
-        </w:rPr>
-        <w:t xml:space="preserve">Nosso  </w:t>
-      </w:r>
-      <w:proofErr w:type="spellStart"/>
-      <w:r>
-        <w:rPr>
-          <w:sz w:val="24"/>
-          <w:szCs w:val="24"/>
-        </w:rPr>
-        <w:t>median</w:t>
-      </w:r>
-      <w:proofErr w:type="spellEnd"/>
-      <w:proofErr w:type="gramEnd"/>
-      <w:r>
-        <w:rPr>
-          <w:sz w:val="24"/>
-          <w:szCs w:val="24"/>
-        </w:rPr>
-        <w:t>: 2.000</w:t>
-      </w:r>
-    </w:p>
-    <w:p>
-      <w:pPr>
-        <w:rPr>
-          <w:sz w:val="24"/>
-          <w:szCs w:val="24"/>
-        </w:rPr>
-      </w:pPr>
-      <w:r>
-        <w:rPr>
-          <w:sz w:val="24"/>
-          <w:szCs w:val="24"/>
-        </w:rPr>
-        <w:t xml:space="preserve">Prof   </w:t>
-      </w:r>
-      <w:proofErr w:type="spellStart"/>
-      <w:r>
-        <w:rPr>
-          <w:sz w:val="24"/>
-          <w:szCs w:val="24"/>
-        </w:rPr>
-        <w:t>median</w:t>
-      </w:r>
-      <w:proofErr w:type="spellEnd"/>
-      <w:r>
-        <w:rPr>
-          <w:sz w:val="24"/>
-          <w:szCs w:val="24"/>
-        </w:rPr>
-        <w:t>: 2.000</w:t>
-      </w:r>
-    </w:p>
-    <w:p>
-      <w:pPr>
-        <w:rPr>
-          <w:sz w:val="24"/>
-          <w:szCs w:val="24"/>
-        </w:rPr>
-      </w:pPr>
-      <w:r>
-        <w:rPr>
-          <w:sz w:val="24"/>
-          <w:szCs w:val="24"/>
-        </w:rPr>
-        <w:t>U = 7999.5, p = 0.0909, r = 0.453</w:t>
-      </w:r>
-    </w:p>
-    <w:p>
-      <w:pPr>
-        <w:rPr>
-          <w:sz w:val="24"/>
-          <w:szCs w:val="24"/>
-        </w:rPr>
-      </w:pPr>
-    </w:p>
-    <w:p>
-      <w:pPr>
-        <w:rPr>
-          <w:sz w:val="24"/>
-          <w:szCs w:val="24"/>
-        </w:rPr>
-      </w:pPr>
-    </w:p>
-    <w:p>
-      <w:pPr>
-        <w:spacing w:line="381" w:lineRule="auto"/>
-        <w:rPr>
-          <w:sz w:val="24"/>
-          <w:szCs w:val="24"/>
+          <w:lang w:val="es-MX"/>
+        </w:rPr>
+      </w:pPr>
+      <w:r>
+        <w:rPr>
+          <w:sz w:val="24"/>
+          <w:szCs w:val="24"/>
+          <w:lang w:val="es-MX"/>
+        </w:rPr>
+        <w:lastRenderedPageBreak/>
+        <w:t>20–30 median: 2.000</w:t>
+      </w:r>
+    </w:p>
+    <w:p>
+      <w:pPr>
+        <w:rPr>
+          <w:sz w:val="24"/>
+          <w:szCs w:val="24"/>
+          <w:lang w:val="es-MX"/>
+        </w:rPr>
+      </w:pPr>
+      <w:r>
+        <w:rPr>
+          <w:sz w:val="24"/>
+          <w:szCs w:val="24"/>
+          <w:lang w:val="es-MX"/>
+        </w:rPr>
+        <w:t>50–60 median: 0.000</w:t>
+      </w:r>
+    </w:p>
+    <w:p>
+      <w:pPr>
+        <w:rPr>
+          <w:sz w:val="24"/>
+          <w:szCs w:val="24"/>
+          <w:lang w:val="es-MX"/>
+        </w:rPr>
+      </w:pPr>
+      <w:r>
+        <w:rPr>
+          <w:sz w:val="24"/>
+          <w:szCs w:val="24"/>
+          <w:lang w:val="es-MX"/>
+        </w:rPr>
+        <w:t>U = 2752.5, p = 0.0001, r = 0.730</w:t>
+      </w:r>
+    </w:p>
+    <w:p>
+      <w:pPr>
+        <w:rPr>
+          <w:sz w:val="24"/>
+          <w:szCs w:val="24"/>
+          <w:lang w:val="es-MX"/>
+        </w:rPr>
+      </w:pPr>
+    </w:p>
+    <w:p>
+      <w:pPr>
+        <w:spacing w:line="381" w:lineRule="auto"/>
+        <w:rPr>
+          <w:sz w:val="24"/>
+          <w:szCs w:val="24"/>
+          <w:lang w:val="es-MX"/>
         </w:rPr>
       </w:pPr>
     </w:p>
@@ -892,65 +1267,58 @@
           <w:sz w:val="24"/>
           <w:szCs w:val="24"/>
         </w:rPr>
-        <w:t xml:space="preserve">Em conjunto, os dados fornecem evidência estatística sólida de que a solução proposta melhora a </w:t>
-      </w:r>
-      <w:r>
-        <w:rPr>
+        <w:t>Em conjunto, os dados fornecem evidência estatística sólida de que a solução proposta melhora a eficiência da interação sem prejudicar a eficácia, cumprindo assim os objetivos definidos no projeto.</w:t>
+      </w:r>
+    </w:p>
+    <w:p>
+      <w:pPr>
+        <w:spacing w:line="381" w:lineRule="auto"/>
+        <w:rPr>
+          <w:sz w:val="24"/>
+          <w:szCs w:val="24"/>
+        </w:rPr>
+      </w:pPr>
+    </w:p>
+    <w:p>
+      <w:pPr>
+        <w:spacing w:line="381" w:lineRule="auto"/>
+        <w:rPr>
+          <w:sz w:val="24"/>
+          <w:szCs w:val="24"/>
+        </w:rPr>
+      </w:pPr>
+      <w:r>
+        <w:rPr>
+          <w:sz w:val="24"/>
+          <w:szCs w:val="24"/>
+        </w:rPr>
+        <w:t>Gráficos obtidos através dos dados:</w:t>
+      </w:r>
+    </w:p>
+    <w:p>
+      <w:pPr>
+        <w:spacing w:line="381" w:lineRule="auto"/>
+        <w:rPr>
+          <w:sz w:val="24"/>
+          <w:szCs w:val="24"/>
+        </w:rPr>
+      </w:pPr>
+    </w:p>
+    <w:p>
+      <w:pPr>
+        <w:spacing w:line="381" w:lineRule="auto"/>
+        <w:rPr>
+          <w:sz w:val="24"/>
+          <w:szCs w:val="24"/>
+        </w:rPr>
+      </w:pPr>
+      <w:r>
+        <w:rPr>
+          <w:noProof/>
           <w:sz w:val="24"/>
           <w:szCs w:val="24"/>
         </w:rPr>
         <w:lastRenderedPageBreak/>
-        <w:t>eficiência da interação sem prejudicar a eficácia, cumprindo assim os objetivos definidos no projeto.</w:t>
-      </w:r>
-    </w:p>
-    <w:p>
-      <w:pPr>
-        <w:spacing w:line="381" w:lineRule="auto"/>
-        <w:rPr>
-          <w:sz w:val="24"/>
-          <w:szCs w:val="24"/>
-        </w:rPr>
-      </w:pPr>
-    </w:p>
-    <w:p>
-      <w:pPr>
-        <w:spacing w:line="381" w:lineRule="auto"/>
-        <w:rPr>
-          <w:sz w:val="24"/>
-          <w:szCs w:val="24"/>
-        </w:rPr>
-      </w:pPr>
-      <w:r>
-        <w:rPr>
-          <w:sz w:val="24"/>
-          <w:szCs w:val="24"/>
-        </w:rPr>
-        <w:t>Gráficos obtidos através dos dados:</w:t>
-      </w:r>
-    </w:p>
-    <w:p>
-      <w:pPr>
-        <w:spacing w:line="381" w:lineRule="auto"/>
-        <w:rPr>
-          <w:sz w:val="24"/>
-          <w:szCs w:val="24"/>
-        </w:rPr>
-      </w:pPr>
-    </w:p>
-    <w:p>
-      <w:pPr>
-        <w:spacing w:line="381" w:lineRule="auto"/>
-        <w:rPr>
-          <w:sz w:val="24"/>
-          <w:szCs w:val="24"/>
-        </w:rPr>
-      </w:pPr>
-      <w:r>
-        <w:rPr>
-          <w:noProof/>
-          <w:sz w:val="24"/>
-          <w:szCs w:val="24"/>
-        </w:rPr>
         <w:drawing>
           <wp:inline distT="0" distB="0" distL="0" distR="0" wp14:anchorId="18D82EDF" wp14:editId="78E40EE7">
             <wp:extent cx="6858000" cy="4286250"/>
@@ -1049,7 +1417,6 @@
           <w:sz w:val="24"/>
           <w:szCs w:val="24"/>
         </w:rPr>
-        <w:lastRenderedPageBreak/>
         <w:drawing>
           <wp:inline distT="0" distB="0" distL="0" distR="0" wp14:anchorId="7CD4DB64" wp14:editId="03B603C4">
             <wp:extent cx="6400800" cy="3657600"/>
@@ -1113,6 +1480,7 @@
           <w:sz w:val="24"/>
           <w:szCs w:val="24"/>
         </w:rPr>
+        <w:lastRenderedPageBreak/>
         <w:t>(gráfico de tempo por alvo)</w:t>
       </w:r>
     </w:p>
@@ -1255,6 +1623,7 @@
           <w:sz w:val="24"/>
           <w:szCs w:val="24"/>
         </w:rPr>
+        <w:lastRenderedPageBreak/>
         <w:drawing>
           <wp:inline distT="0" distB="0" distL="0" distR="0" wp14:anchorId="5384DA3E" wp14:editId="6AF11374">
             <wp:extent cx="6400800" cy="3657600"/>
@@ -1319,6 +1688,347 @@
           <w:szCs w:val="24"/>
         </w:rPr>
         <w:t>(gráfico de taxa de sucesso)</w:t>
+      </w:r>
+    </w:p>
+    <w:p>
+      <w:pPr>
+        <w:spacing w:line="381" w:lineRule="auto"/>
+        <w:rPr>
+          <w:sz w:val="24"/>
+          <w:szCs w:val="24"/>
+        </w:rPr>
+      </w:pPr>
+    </w:p>
+    <w:p>
+      <w:pPr>
+        <w:spacing w:line="381" w:lineRule="auto"/>
+        <w:rPr>
+          <w:sz w:val="24"/>
+          <w:szCs w:val="24"/>
+        </w:rPr>
+      </w:pPr>
+    </w:p>
+    <w:p>
+      <w:pPr>
+        <w:spacing w:line="381" w:lineRule="auto"/>
+        <w:rPr>
+          <w:sz w:val="24"/>
+          <w:szCs w:val="24"/>
+        </w:rPr>
+      </w:pPr>
+      <w:r>
+        <w:rPr>
+          <w:sz w:val="24"/>
+          <w:szCs w:val="24"/>
+        </w:rPr>
+        <w:t>Gráficos obtidos com a comparação entre faixas etárias:</w:t>
+      </w:r>
+    </w:p>
+    <w:p>
+      <w:pPr>
+        <w:spacing w:line="381" w:lineRule="auto"/>
+        <w:rPr>
+          <w:sz w:val="24"/>
+          <w:szCs w:val="24"/>
+        </w:rPr>
+      </w:pPr>
+    </w:p>
+    <w:p>
+      <w:pPr>
+        <w:spacing w:line="381" w:lineRule="auto"/>
+        <w:rPr>
+          <w:sz w:val="24"/>
+          <w:szCs w:val="24"/>
+        </w:rPr>
+      </w:pPr>
+      <w:r>
+        <w:rPr>
+          <w:sz w:val="24"/>
+          <w:szCs w:val="24"/>
+        </w:rPr>
+        <w:drawing>
+          <wp:inline distT="0" distB="0" distL="0" distR="0" wp14:anchorId="2C7324B8" wp14:editId="585484BA">
+            <wp:extent cx="6639852" cy="3791479"/>
+            <wp:effectExtent l="0" t="0" r="8890" b="0"/>
+            <wp:docPr id="1264446650" name="Picture 1"/>
+            <wp:cNvGraphicFramePr>
+              <a:graphicFrameLocks xmlns:a="http://schemas.openxmlformats.org/drawingml/2006/main" noChangeAspect="1"/>
+            </wp:cNvGraphicFramePr>
+            <a:graphic xmlns:a="http://schemas.openxmlformats.org/drawingml/2006/main">
+              <a:graphicData uri="http://schemas.openxmlformats.org/drawingml/2006/picture">
+                <pic:pic xmlns:pic="http://schemas.openxmlformats.org/drawingml/2006/picture">
+                  <pic:nvPicPr>
+                    <pic:cNvPr id="1264446650" name=""/>
+                    <pic:cNvPicPr/>
+                  </pic:nvPicPr>
+                  <pic:blipFill>
+                    <a:blip r:embed="rId10"/>
+                    <a:stretch>
+                      <a:fillRect/>
+                    </a:stretch>
+                  </pic:blipFill>
+                  <pic:spPr>
+                    <a:xfrm>
+                      <a:off x="0" y="0"/>
+                      <a:ext cx="6639852" cy="3791479"/>
+                    </a:xfrm>
+                    <a:prstGeom prst="rect">
+                      <a:avLst/>
+                    </a:prstGeom>
+                  </pic:spPr>
+                </pic:pic>
+              </a:graphicData>
+            </a:graphic>
+          </wp:inline>
+        </w:drawing>
+      </w:r>
+    </w:p>
+    <w:p>
+      <w:pPr>
+        <w:spacing w:line="381" w:lineRule="auto"/>
+        <w:rPr>
+          <w:sz w:val="24"/>
+          <w:szCs w:val="24"/>
+        </w:rPr>
+      </w:pPr>
+      <w:r>
+        <w:rPr>
+          <w:sz w:val="24"/>
+          <w:szCs w:val="24"/>
+        </w:rPr>
+        <w:lastRenderedPageBreak/>
+        <w:t>(</w:t>
+      </w:r>
+      <w:r>
+        <w:rPr>
+          <w:sz w:val="24"/>
+          <w:szCs w:val="24"/>
+        </w:rPr>
+        <w:t>gráfico de tempo por alvo</w:t>
+      </w:r>
+      <w:r>
+        <w:rPr>
+          <w:sz w:val="24"/>
+          <w:szCs w:val="24"/>
+        </w:rPr>
+        <w:t>)</w:t>
+      </w:r>
+    </w:p>
+    <w:p>
+      <w:pPr>
+        <w:spacing w:line="381" w:lineRule="auto"/>
+        <w:rPr>
+          <w:sz w:val="24"/>
+          <w:szCs w:val="24"/>
+        </w:rPr>
+      </w:pPr>
+    </w:p>
+    <w:p>
+      <w:pPr>
+        <w:spacing w:line="381" w:lineRule="auto"/>
+        <w:rPr>
+          <w:sz w:val="24"/>
+          <w:szCs w:val="24"/>
+        </w:rPr>
+      </w:pPr>
+      <w:r>
+        <w:rPr>
+          <w:sz w:val="24"/>
+          <w:szCs w:val="24"/>
+        </w:rPr>
+        <w:drawing>
+          <wp:inline distT="0" distB="0" distL="0" distR="0" wp14:anchorId="6630ADD5" wp14:editId="7489A63B">
+            <wp:extent cx="6649378" cy="3781953"/>
+            <wp:effectExtent l="0" t="0" r="0" b="9525"/>
+            <wp:docPr id="1842724737" name="Picture 1"/>
+            <wp:cNvGraphicFramePr>
+              <a:graphicFrameLocks xmlns:a="http://schemas.openxmlformats.org/drawingml/2006/main" noChangeAspect="1"/>
+            </wp:cNvGraphicFramePr>
+            <a:graphic xmlns:a="http://schemas.openxmlformats.org/drawingml/2006/main">
+              <a:graphicData uri="http://schemas.openxmlformats.org/drawingml/2006/picture">
+                <pic:pic xmlns:pic="http://schemas.openxmlformats.org/drawingml/2006/picture">
+                  <pic:nvPicPr>
+                    <pic:cNvPr id="1842724737" name=""/>
+                    <pic:cNvPicPr/>
+                  </pic:nvPicPr>
+                  <pic:blipFill>
+                    <a:blip r:embed="rId11"/>
+                    <a:stretch>
+                      <a:fillRect/>
+                    </a:stretch>
+                  </pic:blipFill>
+                  <pic:spPr>
+                    <a:xfrm>
+                      <a:off x="0" y="0"/>
+                      <a:ext cx="6649378" cy="3781953"/>
+                    </a:xfrm>
+                    <a:prstGeom prst="rect">
+                      <a:avLst/>
+                    </a:prstGeom>
+                  </pic:spPr>
+                </pic:pic>
+              </a:graphicData>
+            </a:graphic>
+          </wp:inline>
+        </w:drawing>
+      </w:r>
+    </w:p>
+    <w:p>
+      <w:pPr>
+        <w:spacing w:line="381" w:lineRule="auto"/>
+        <w:rPr>
+          <w:sz w:val="24"/>
+          <w:szCs w:val="24"/>
+        </w:rPr>
+      </w:pPr>
+      <w:r>
+        <w:rPr>
+          <w:sz w:val="24"/>
+          <w:szCs w:val="24"/>
+        </w:rPr>
+        <w:t>(gráfico de número de erros cometidos)</w:t>
+      </w:r>
+    </w:p>
+    <w:p>
+      <w:pPr>
+        <w:spacing w:line="381" w:lineRule="auto"/>
+        <w:rPr>
+          <w:sz w:val="24"/>
+          <w:szCs w:val="24"/>
+        </w:rPr>
+      </w:pPr>
+    </w:p>
+    <w:p>
+      <w:pPr>
+        <w:spacing w:line="381" w:lineRule="auto"/>
+        <w:rPr>
+          <w:sz w:val="24"/>
+          <w:szCs w:val="24"/>
+        </w:rPr>
+      </w:pPr>
+      <w:r>
+        <w:rPr>
+          <w:sz w:val="24"/>
+          <w:szCs w:val="24"/>
+        </w:rPr>
+        <w:drawing>
+          <wp:inline distT="0" distB="0" distL="0" distR="0" wp14:anchorId="6871D65D" wp14:editId="7239A0B9">
+            <wp:extent cx="6649378" cy="3791479"/>
+            <wp:effectExtent l="0" t="0" r="0" b="0"/>
+            <wp:docPr id="718751394" name="Picture 1"/>
+            <wp:cNvGraphicFramePr>
+              <a:graphicFrameLocks xmlns:a="http://schemas.openxmlformats.org/drawingml/2006/main" noChangeAspect="1"/>
+            </wp:cNvGraphicFramePr>
+            <a:graphic xmlns:a="http://schemas.openxmlformats.org/drawingml/2006/main">
+              <a:graphicData uri="http://schemas.openxmlformats.org/drawingml/2006/picture">
+                <pic:pic xmlns:pic="http://schemas.openxmlformats.org/drawingml/2006/picture">
+                  <pic:nvPicPr>
+                    <pic:cNvPr id="718751394" name=""/>
+                    <pic:cNvPicPr/>
+                  </pic:nvPicPr>
+                  <pic:blipFill>
+                    <a:blip r:embed="rId12"/>
+                    <a:stretch>
+                      <a:fillRect/>
+                    </a:stretch>
+                  </pic:blipFill>
+                  <pic:spPr>
+                    <a:xfrm>
+                      <a:off x="0" y="0"/>
+                      <a:ext cx="6649378" cy="3791479"/>
+                    </a:xfrm>
+                    <a:prstGeom prst="rect">
+                      <a:avLst/>
+                    </a:prstGeom>
+                  </pic:spPr>
+                </pic:pic>
+              </a:graphicData>
+            </a:graphic>
+          </wp:inline>
+        </w:drawing>
+      </w:r>
+    </w:p>
+    <w:p>
+      <w:pPr>
+        <w:spacing w:line="381" w:lineRule="auto"/>
+        <w:rPr>
+          <w:sz w:val="24"/>
+          <w:szCs w:val="24"/>
+        </w:rPr>
+      </w:pPr>
+      <w:r>
+        <w:rPr>
+          <w:sz w:val="24"/>
+          <w:szCs w:val="24"/>
+        </w:rPr>
+        <w:t>(gráfico de taxa de sucesso)</w:t>
+      </w:r>
+    </w:p>
+    <w:p>
+      <w:pPr>
+        <w:spacing w:line="381" w:lineRule="auto"/>
+        <w:rPr>
+          <w:sz w:val="24"/>
+          <w:szCs w:val="24"/>
+        </w:rPr>
+      </w:pPr>
+      <w:r>
+        <w:rPr>
+          <w:sz w:val="24"/>
+          <w:szCs w:val="24"/>
+        </w:rPr>
+        <w:lastRenderedPageBreak/>
+        <w:drawing>
+          <wp:inline distT="0" distB="0" distL="0" distR="0" wp14:anchorId="1F2AE9B2" wp14:editId="4C54182C">
+            <wp:extent cx="6639852" cy="3772426"/>
+            <wp:effectExtent l="0" t="0" r="8890" b="0"/>
+            <wp:docPr id="1638766464" name="Picture 1"/>
+            <wp:cNvGraphicFramePr>
+              <a:graphicFrameLocks xmlns:a="http://schemas.openxmlformats.org/drawingml/2006/main" noChangeAspect="1"/>
+            </wp:cNvGraphicFramePr>
+            <a:graphic xmlns:a="http://schemas.openxmlformats.org/drawingml/2006/main">
+              <a:graphicData uri="http://schemas.openxmlformats.org/drawingml/2006/picture">
+                <pic:pic xmlns:pic="http://schemas.openxmlformats.org/drawingml/2006/picture">
+                  <pic:nvPicPr>
+                    <pic:cNvPr id="1638766464" name=""/>
+                    <pic:cNvPicPr/>
+                  </pic:nvPicPr>
+                  <pic:blipFill>
+                    <a:blip r:embed="rId13"/>
+                    <a:stretch>
+                      <a:fillRect/>
+                    </a:stretch>
+                  </pic:blipFill>
+                  <pic:spPr>
+                    <a:xfrm>
+                      <a:off x="0" y="0"/>
+                      <a:ext cx="6639852" cy="3772426"/>
+                    </a:xfrm>
+                    <a:prstGeom prst="rect">
+                      <a:avLst/>
+                    </a:prstGeom>
+                  </pic:spPr>
+                </pic:pic>
+              </a:graphicData>
+            </a:graphic>
+          </wp:inline>
+        </w:drawing>
+      </w:r>
+    </w:p>
+    <w:p>
+      <w:pPr>
+        <w:spacing w:line="381" w:lineRule="auto"/>
+        <w:rPr>
+          <w:sz w:val="24"/>
+          <w:szCs w:val="24"/>
+        </w:rPr>
+      </w:pPr>
+      <w:r>
+        <w:rPr>
+          <w:sz w:val="24"/>
+          <w:szCs w:val="24"/>
+        </w:rPr>
+        <w:t>(gráfico de tempo demorado)</w:t>
       </w:r>
     </w:p>
     <w:sectPr>

</xml_diff>